<commit_message>
feat: base de datos completa — schema Prisma, migraciones y seed
- Schema Prisma con todas las entidades del modelo de datos
- Migración init (tablas relacionales + sensor_readings)
- Migración TimescaleDB (hypertable + compresión + trigger LISTEN/NOTIFY)
- Seed con datos realistas: 1 org, 2 usuarios, 2 sistemas, 4 trayectos, 500 lecturas, 8 alertas
- CLAUDE.md con contexto completo del proyecto para continuidad
- ADR-012 (monorepo) añadida al docx de decisiones
- Prisma 6 (compatible con TimescaleDB)

Co-Authored-By: Claude Opus 4.6 (1M context) <noreply@anthropic.com>
</commit_message>
<xml_diff>
--- a/docs/decisiones_arquitectonicas.docx
+++ b/docs/decisiones_arquitectonicas.docx
@@ -155,6 +155,15 @@
           <w:b/>
         </w:rPr>
         <w:t>ADR-011: Estrategia de entornos — dev, test, staging, producción</w:t>
+      </w:r>
+      <w:r>
+        <w:br/>
+      </w:r>
+      <w:r>
+        <w:rPr>
+          <w:b/>
+        </w:rPr>
+        <w:t>ADR-012: Organización del código — Monorepo</w:t>
       </w:r>
     </w:p>
     <w:p/>
@@ -11389,6 +11398,409 @@
         </w:tc>
       </w:tr>
     </w:tbl>
+    <w:p>
+      <w:pPr>
+        <w:pStyle w:val="Heading2"/>
+      </w:pPr>
+      <w:r>
+        <w:t>Estado</w:t>
+      </w:r>
+    </w:p>
+    <w:p>
+      <w:r>
+        <w:rPr>
+          <w:b/>
+          <w:color w:val="228B22"/>
+        </w:rPr>
+        <w:t>✅ Aceptada</w:t>
+      </w:r>
+    </w:p>
+    <w:p>
+      <w:r>
+        <w:br w:type="page"/>
+      </w:r>
+    </w:p>
+    <w:p>
+      <w:pPr>
+        <w:pStyle w:val="Heading1"/>
+      </w:pPr>
+      <w:r>
+        <w:t>ADR-012: Organización del código — Monorepo</w:t>
+      </w:r>
+    </w:p>
+    <w:p>
+      <w:pPr>
+        <w:pStyle w:val="Heading2"/>
+      </w:pPr>
+      <w:r>
+        <w:t>Contexto</w:t>
+      </w:r>
+    </w:p>
+    <w:p>
+      <w:r>
+        <w:t>La plataforma InspectRail consta de 5 servicios (base de datos, ingesta, análisis, API y frontend) que se desarrollan, testean y despliegan de forma independiente como contenedores Docker. Se evalúa si organizar el código en un solo repositorio (monorepo) o en repositorios separados (multi-repo).</w:t>
+      </w:r>
+    </w:p>
+    <w:tbl>
+      <w:tblPr>
+        <w:tblStyle w:val="MediumShading1-Accent1"/>
+        <w:tblW w:type="auto" w:w="0"/>
+        <w:jc w:val="center"/>
+        <w:tblLook w:firstColumn="1" w:firstRow="1" w:lastColumn="0" w:lastRow="0" w:noHBand="0" w:noVBand="1" w:val="04A0"/>
+      </w:tblPr>
+      <w:tblGrid>
+        <w:gridCol w:w="2160"/>
+        <w:gridCol w:w="2160"/>
+        <w:gridCol w:w="2160"/>
+        <w:gridCol w:w="2160"/>
+      </w:tblGrid>
+      <w:tr>
+        <w:tc>
+          <w:tcPr>
+            <w:tcW w:type="dxa" w:w="2160"/>
+          </w:tcPr>
+          <w:p>
+            <w:r>
+              <w:rPr>
+                <w:sz w:val="18"/>
+              </w:rPr>
+              <w:t>Opción</w:t>
+            </w:r>
+          </w:p>
+        </w:tc>
+        <w:tc>
+          <w:tcPr>
+            <w:tcW w:type="dxa" w:w="2160"/>
+          </w:tcPr>
+          <w:p>
+            <w:r>
+              <w:rPr>
+                <w:sz w:val="18"/>
+              </w:rPr>
+              <w:t>Descripción</w:t>
+            </w:r>
+          </w:p>
+        </w:tc>
+        <w:tc>
+          <w:tcPr>
+            <w:tcW w:type="dxa" w:w="2160"/>
+          </w:tcPr>
+          <w:p>
+            <w:r>
+              <w:rPr>
+                <w:sz w:val="18"/>
+              </w:rPr>
+              <w:t>Ventajas</w:t>
+            </w:r>
+          </w:p>
+        </w:tc>
+        <w:tc>
+          <w:tcPr>
+            <w:tcW w:type="dxa" w:w="2160"/>
+          </w:tcPr>
+          <w:p>
+            <w:r>
+              <w:rPr>
+                <w:sz w:val="18"/>
+              </w:rPr>
+              <w:t>Inconvenientes</w:t>
+            </w:r>
+          </w:p>
+        </w:tc>
+      </w:tr>
+      <w:tr>
+        <w:tc>
+          <w:tcPr>
+            <w:tcW w:type="dxa" w:w="2160"/>
+          </w:tcPr>
+          <w:p>
+            <w:r>
+              <w:rPr>
+                <w:sz w:val="18"/>
+              </w:rPr>
+              <w:t>Monorepo</w:t>
+            </w:r>
+          </w:p>
+        </w:tc>
+        <w:tc>
+          <w:tcPr>
+            <w:tcW w:type="dxa" w:w="2160"/>
+          </w:tcPr>
+          <w:p>
+            <w:r>
+              <w:rPr>
+                <w:sz w:val="18"/>
+              </w:rPr>
+              <w:t>Todo el código en un solo repositorio, organizado en carpetas por servicio. Cada servicio tiene su propio Dockerfile, dependencias y tests.</w:t>
+            </w:r>
+          </w:p>
+        </w:tc>
+        <w:tc>
+          <w:tcPr>
+            <w:tcW w:type="dxa" w:w="2160"/>
+          </w:tcPr>
+          <w:p>
+            <w:r>
+              <w:rPr>
+                <w:sz w:val="18"/>
+              </w:rPr>
+              <w:t>• Un solo git clone para tener todo el proyecto</w:t>
+              <w:br/>
+              <w:t>• Cambios cross-service en un solo PR</w:t>
+              <w:br/>
+              <w:t>• Docker Compose funciona directo con paths relativos</w:t>
+              <w:br/>
+              <w:t>• Código compartido sin publicar paquetes (schemas, tipos, validaciones)</w:t>
+              <w:br/>
+              <w:t>• CI/CD detecta qué servicio cambió y ejecuta solo lo necesario</w:t>
+              <w:br/>
+              <w:t>• Onboarding inmediato: clonar y trabajar</w:t>
+              <w:br/>
+              <w:t>• Un solo historial de git para trazabilidad</w:t>
+              <w:br/>
+              <w:t>• Es lo que usan Google, Facebook, Uber y la mayoría de startups</w:t>
+            </w:r>
+          </w:p>
+        </w:tc>
+        <w:tc>
+          <w:tcPr>
+            <w:tcW w:type="dxa" w:w="2160"/>
+          </w:tcPr>
+          <w:p>
+            <w:r>
+              <w:rPr>
+                <w:sz w:val="18"/>
+              </w:rPr>
+              <w:t>• El repositorio crece con el tiempo</w:t>
+              <w:br/>
+              <w:t>• Requiere disciplina en la organización de carpetas</w:t>
+              <w:br/>
+              <w:t>• CI/CD algo más complejo (detectar qué cambió)</w:t>
+              <w:br/>
+              <w:t>• Permisos de acceso son todo-o-nada (mitigable con CODEOWNERS)</w:t>
+            </w:r>
+          </w:p>
+        </w:tc>
+      </w:tr>
+      <w:tr>
+        <w:tc>
+          <w:tcPr>
+            <w:tcW w:type="dxa" w:w="2160"/>
+          </w:tcPr>
+          <w:p>
+            <w:r>
+              <w:rPr>
+                <w:sz w:val="18"/>
+              </w:rPr>
+              <w:t>Multi-repo</w:t>
+            </w:r>
+          </w:p>
+        </w:tc>
+        <w:tc>
+          <w:tcPr>
+            <w:tcW w:type="dxa" w:w="2160"/>
+          </w:tcPr>
+          <w:p>
+            <w:r>
+              <w:rPr>
+                <w:sz w:val="18"/>
+              </w:rPr>
+              <w:t>Un repositorio por servicio: inspectrail-api, inspectrail-frontend, inspectrail-ingesta, etc.</w:t>
+            </w:r>
+          </w:p>
+        </w:tc>
+        <w:tc>
+          <w:tcPr>
+            <w:tcW w:type="dxa" w:w="2160"/>
+          </w:tcPr>
+          <w:p>
+            <w:r>
+              <w:rPr>
+                <w:sz w:val="18"/>
+              </w:rPr>
+              <w:t>• Cada servicio totalmente aislado</w:t>
+              <w:br/>
+              <w:t>• Ciclos de release independientes</w:t>
+              <w:br/>
+              <w:t>• Permisos granulares por repo</w:t>
+              <w:br/>
+              <w:t>• CI/CD simple por repo individual</w:t>
+              <w:br/>
+              <w:t>• Es lo que usan Amazon, Netflix con equipos grandes</w:t>
+            </w:r>
+          </w:p>
+        </w:tc>
+        <w:tc>
+          <w:tcPr>
+            <w:tcW w:type="dxa" w:w="2160"/>
+          </w:tcPr>
+          <w:p>
+            <w:r>
+              <w:rPr>
+                <w:sz w:val="18"/>
+              </w:rPr>
+              <w:t>• Cambios cross-service requieren coordinar múltiples PRs en múltiples repos</w:t>
+              <w:br/>
+              <w:t>• Docker Compose no funciona directo (necesita clonar todos los repos o usar submódulos)</w:t>
+              <w:br/>
+              <w:t>• Código compartido requiere publicar paquetes internos (npm/pip)</w:t>
+              <w:br/>
+              <w:t>• Onboarding: clonar 5+ repos, configurar cada uno</w:t>
+              <w:br/>
+              <w:t>• Versionado distribuido: mantener compatibilidad entre repos</w:t>
+              <w:br/>
+              <w:t>• Overkill para equipos pequeños (&lt;10 desarrolladores)</w:t>
+            </w:r>
+          </w:p>
+        </w:tc>
+      </w:tr>
+    </w:tbl>
+    <w:p/>
+    <w:p>
+      <w:pPr>
+        <w:pStyle w:val="Heading2"/>
+      </w:pPr>
+      <w:r>
+        <w:t>Decisión</w:t>
+      </w:r>
+    </w:p>
+    <w:p>
+      <w:r>
+        <w:rPr>
+          <w:b/>
+        </w:rPr>
+        <w:t>Se adopta monorepo: todo el código en un solo repositorio (github.com/m-monterde/inspectrail).</w:t>
+      </w:r>
+    </w:p>
+    <w:p>
+      <w:pPr>
+        <w:pStyle w:val="Heading2"/>
+      </w:pPr>
+      <w:r>
+        <w:t>Justificación</w:t>
+      </w:r>
+    </w:p>
+    <w:p>
+      <w:r>
+        <w:rPr>
+          <w:b/>
+        </w:rPr>
+        <w:t xml:space="preserve">Equipo pequeño, cambios frecuentes cross-service: </w:t>
+      </w:r>
+      <w:r>
+        <w:t>InspectRail es una startup con un equipo reducido donde los mismos desarrolladores tocan múltiples servicios. Un cambio típico como "añadir nueva métrica de sensor" afecta a la BD (migración), ingesta (nuevo campo), análisis (nuevo umbral), API (campo GraphQL) y frontend (nueva gráfica). En monorepo esto es un solo PR con contexto completo. En multi-repo serían 5 PRs coordinados en 5 repositorios, con riesgo de desincronización y overhead de gestión.</w:t>
+      </w:r>
+    </w:p>
+    <w:p>
+      <w:r>
+        <w:rPr>
+          <w:b/>
+        </w:rPr>
+        <w:t xml:space="preserve">Docker Compose funcional directo: </w:t>
+      </w:r>
+      <w:r>
+        <w:t>El docker-compose.yml referencia los servicios con paths relativos (../../services/api). Con multi-repo, el Docker Compose necesitaría que todos los repos estuvieran clonados en la misma estructura de directorios, o usar submódulos git (frágiles y complejos). Con monorepo, git clone + docker compose up y todo funciona.</w:t>
+      </w:r>
+    </w:p>
+    <w:p>
+      <w:r>
+        <w:rPr>
+          <w:b/>
+        </w:rPr>
+        <w:t xml:space="preserve">Onboarding de un solo paso: </w:t>
+      </w:r>
+      <w:r>
+        <w:t>Un nuevo desarrollador clona un repo, copia .env.example y tiene todo el proyecto funcional. Con multi-repo tendría que clonar 5+ repos, configurar cada uno por separado y asegurar que las versiones son compatibles entre sí. Para una startup que contrata, la velocidad de onboarding es crítica.</w:t>
+      </w:r>
+    </w:p>
+    <w:p>
+      <w:r>
+        <w:rPr>
+          <w:b/>
+        </w:rPr>
+        <w:t xml:space="preserve">Código compartido sin fricción: </w:t>
+      </w:r>
+      <w:r>
+        <w:t>Los servicios Python (ingesta y análisis) comparten modelos de datos y validaciones. La API y el frontend comparten schemas GraphQL. En monorepo, el código compartido es una carpeta con imports directos. En multi-repo requiere publicar y versionar paquetes internos (npm/pip), lo que añade complejidad y ciclos de publicación.</w:t>
+      </w:r>
+    </w:p>
+    <w:p>
+      <w:r>
+        <w:rPr>
+          <w:b/>
+        </w:rPr>
+        <w:t xml:space="preserve">CI/CD inteligente: </w:t>
+      </w:r>
+      <w:r>
+        <w:t>GitHub Actions detecta qué archivos cambiaron en cada push y ejecuta solo los pipelines afectados. Si solo cambia el frontend, solo se ejecutan lint y tests de frontend. Esto elimina la principal desventaja del monorepo (ejecutar todo en cada cambio) manteniendo las ventajas.</w:t>
+      </w:r>
+    </w:p>
+    <w:p>
+      <w:r>
+        <w:rPr>
+          <w:b/>
+        </w:rPr>
+        <w:t xml:space="preserve">Trazabilidad completa: </w:t>
+      </w:r>
+      <w:r>
+        <w:t>Un solo historial de git permite ver en un commit todos los cambios relacionados de un feature o fix, incluyendo BD, backend y frontend. Con multi-repo, la trazabilidad requiere cruzar historiales de múltiples repos.</w:t>
+      </w:r>
+    </w:p>
+    <w:p>
+      <w:r>
+        <w:rPr>
+          <w:b/>
+        </w:rPr>
+        <w:t xml:space="preserve">Despliegue independiente: </w:t>
+      </w:r>
+      <w:r>
+        <w:t>Monorepo no significa monolito. Cada servicio tiene su propio Dockerfile, se construye como imagen Docker independiente y se despliega por separado. El CI/CD solo construye y despliega las imágenes de los servicios que cambiaron. La organización del código (monorepo) es independiente de la arquitectura de despliegue (microservicios).</w:t>
+      </w:r>
+    </w:p>
+    <w:p>
+      <w:pPr>
+        <w:pStyle w:val="Heading2"/>
+      </w:pPr>
+      <w:r>
+        <w:t>Estructura del monorepo</w:t>
+      </w:r>
+    </w:p>
+    <w:p>
+      <w:r>
+        <w:t>inspectrail/</w:t>
+        <w:br/>
+        <w:t>├── services/</w:t>
+        <w:br/>
+        <w:t>│   ├── api/              ← package.json, Dockerfile, tests propios</w:t>
+        <w:br/>
+        <w:t>│   ├── frontend/         ← package.json, Dockerfile, tests propios</w:t>
+        <w:br/>
+        <w:t>│   ├── ingesta/          ← requirements.txt, Dockerfile, tests propios</w:t>
+        <w:br/>
+        <w:t>│   ├── analisis/         ← requirements.txt, Dockerfile, tests propios</w:t>
+        <w:br/>
+        <w:t>│   └── database/         ← Migraciones, seeds</w:t>
+        <w:br/>
+        <w:t>├── devops/               ← Docker Compose, CI/CD, scripts</w:t>
+        <w:br/>
+        <w:t>├── docs/                 ← Documentación compartida</w:t>
+        <w:br/>
+        <w:t>└── README.md</w:t>
+      </w:r>
+    </w:p>
+    <w:p>
+      <w:pPr>
+        <w:pStyle w:val="Heading2"/>
+      </w:pPr>
+      <w:r>
+        <w:t>Cuándo migrar a multi-repo</w:t>
+      </w:r>
+    </w:p>
+    <w:p>
+      <w:r>
+        <w:t>Si en el futuro el equipo crece significativamente (+15-20 desarrolladores) y se forman equipos dedicados por servicio con ciclos de release independientes, la migración a multi-repo es viable. Cada carpeta de services/ se extrae a su propio repositorio preservando el historial de git (git filter-branch o git-filter-repo). Esta decisión es reversible a coste moderado.</w:t>
+      </w:r>
+    </w:p>
     <w:p>
       <w:pPr>
         <w:pStyle w:val="Heading2"/>

</xml_diff>